<commit_message>
update made to ppt
</commit_message>
<xml_diff>
--- a/Ruslan Report.docx
+++ b/Ruslan Report.docx
@@ -468,13 +468,6 @@
           <w:szCs w:val="28"/>
         </w:rPr>
         <w:tab/>
-      </w:r>
-      <w:r>
-        <w:rPr>
-          <w:rFonts w:ascii="Times New Roman" w:hAnsi="Times New Roman" w:cs="Times New Roman"/>
-          <w:sz w:val="28"/>
-          <w:szCs w:val="28"/>
-        </w:rPr>
         <w:t>Hariharan Muthu</w:t>
       </w:r>
     </w:p>
@@ -12685,58 +12678,32 @@
       <w:r>
         <w:t xml:space="preserve">Figure </w:t>
       </w:r>
-      <w:r>
-        <w:fldChar w:fldCharType="begin"/>
-      </w:r>
-      <w:r>
-        <w:instrText xml:space="preserve"> STYLEREF 1 \s </w:instrText>
-      </w:r>
-      <w:r>
-        <w:fldChar w:fldCharType="separate"/>
-      </w:r>
-      <w:r>
-        <w:rPr>
-          <w:noProof/>
-          <w:cs/>
-        </w:rPr>
-        <w:t>‎</w:t>
-      </w:r>
-      <w:r>
-        <w:rPr>
-          <w:noProof/>
-        </w:rPr>
-        <w:t>1</w:t>
-      </w:r>
-      <w:r>
-        <w:rPr>
-          <w:noProof/>
-        </w:rPr>
-        <w:fldChar w:fldCharType="end"/>
-      </w:r>
+      <w:fldSimple w:instr=" STYLEREF 1 \s ">
+        <w:r>
+          <w:rPr>
+            <w:noProof/>
+            <w:cs/>
+          </w:rPr>
+          <w:t>‎</w:t>
+        </w:r>
+        <w:r>
+          <w:rPr>
+            <w:noProof/>
+          </w:rPr>
+          <w:t>1</w:t>
+        </w:r>
+      </w:fldSimple>
       <w:r>
         <w:t>.</w:t>
       </w:r>
-      <w:r>
-        <w:fldChar w:fldCharType="begin"/>
-      </w:r>
-      <w:r>
-        <w:instrText xml:space="preserve"> SEQ Figure \* ARABIC \s 1 </w:instrText>
-      </w:r>
-      <w:r>
-        <w:fldChar w:fldCharType="separate"/>
-      </w:r>
-      <w:r>
-        <w:rPr>
-          <w:noProof/>
-        </w:rPr>
-        <w:t>1</w:t>
-      </w:r>
-      <w:r>
-        <w:rPr>
-          <w:noProof/>
-        </w:rPr>
-        <w:fldChar w:fldCharType="end"/>
-      </w:r>
+      <w:fldSimple w:instr=" SEQ Figure \* ARABIC \s 1 ">
+        <w:r>
+          <w:rPr>
+            <w:noProof/>
+          </w:rPr>
+          <w:t>1</w:t>
+        </w:r>
+      </w:fldSimple>
       <w:r>
         <w:rPr>
           <w:lang w:val="en-US"/>
@@ -13224,58 +13191,32 @@
       <w:r>
         <w:t xml:space="preserve">Figure </w:t>
       </w:r>
-      <w:r>
-        <w:fldChar w:fldCharType="begin"/>
-      </w:r>
-      <w:r>
-        <w:instrText xml:space="preserve"> STYLEREF 1 \s </w:instrText>
-      </w:r>
-      <w:r>
-        <w:fldChar w:fldCharType="separate"/>
-      </w:r>
-      <w:r>
-        <w:rPr>
-          <w:noProof/>
-          <w:cs/>
-        </w:rPr>
-        <w:t>‎</w:t>
-      </w:r>
-      <w:r>
-        <w:rPr>
-          <w:noProof/>
-        </w:rPr>
-        <w:t>3</w:t>
-      </w:r>
-      <w:r>
-        <w:rPr>
-          <w:noProof/>
-        </w:rPr>
-        <w:fldChar w:fldCharType="end"/>
-      </w:r>
+      <w:fldSimple w:instr=" STYLEREF 1 \s ">
+        <w:r>
+          <w:rPr>
+            <w:noProof/>
+            <w:cs/>
+          </w:rPr>
+          <w:t>‎</w:t>
+        </w:r>
+        <w:r>
+          <w:rPr>
+            <w:noProof/>
+          </w:rPr>
+          <w:t>3</w:t>
+        </w:r>
+      </w:fldSimple>
       <w:r>
         <w:t>.</w:t>
       </w:r>
-      <w:r>
-        <w:fldChar w:fldCharType="begin"/>
-      </w:r>
-      <w:r>
-        <w:instrText xml:space="preserve"> SEQ Figure \* ARABIC \s 1 </w:instrText>
-      </w:r>
-      <w:r>
-        <w:fldChar w:fldCharType="separate"/>
-      </w:r>
-      <w:r>
-        <w:rPr>
-          <w:noProof/>
-        </w:rPr>
-        <w:t>1</w:t>
-      </w:r>
-      <w:r>
-        <w:rPr>
-          <w:noProof/>
-        </w:rPr>
-        <w:fldChar w:fldCharType="end"/>
-      </w:r>
+      <w:fldSimple w:instr=" SEQ Figure \* ARABIC \s 1 ">
+        <w:r>
+          <w:rPr>
+            <w:noProof/>
+          </w:rPr>
+          <w:t>1</w:t>
+        </w:r>
+      </w:fldSimple>
       <w:r>
         <w:rPr>
           <w:rFonts w:cs="Times New Roman"/>
@@ -13612,58 +13553,32 @@
       <w:r>
         <w:t xml:space="preserve">Figure </w:t>
       </w:r>
-      <w:r>
-        <w:fldChar w:fldCharType="begin"/>
-      </w:r>
-      <w:r>
-        <w:instrText xml:space="preserve"> STYLEREF 1 \s </w:instrText>
-      </w:r>
-      <w:r>
-        <w:fldChar w:fldCharType="separate"/>
-      </w:r>
-      <w:r>
-        <w:rPr>
-          <w:noProof/>
-          <w:cs/>
-        </w:rPr>
-        <w:t>‎</w:t>
-      </w:r>
-      <w:r>
-        <w:rPr>
-          <w:noProof/>
-        </w:rPr>
-        <w:t>3</w:t>
-      </w:r>
-      <w:r>
-        <w:rPr>
-          <w:noProof/>
-        </w:rPr>
-        <w:fldChar w:fldCharType="end"/>
-      </w:r>
+      <w:fldSimple w:instr=" STYLEREF 1 \s ">
+        <w:r>
+          <w:rPr>
+            <w:noProof/>
+            <w:cs/>
+          </w:rPr>
+          <w:t>‎</w:t>
+        </w:r>
+        <w:r>
+          <w:rPr>
+            <w:noProof/>
+          </w:rPr>
+          <w:t>3</w:t>
+        </w:r>
+      </w:fldSimple>
       <w:r>
         <w:t>.</w:t>
       </w:r>
-      <w:r>
-        <w:fldChar w:fldCharType="begin"/>
-      </w:r>
-      <w:r>
-        <w:instrText xml:space="preserve"> SEQ Figure \* ARABIC \s 1 </w:instrText>
-      </w:r>
-      <w:r>
-        <w:fldChar w:fldCharType="separate"/>
-      </w:r>
-      <w:r>
-        <w:rPr>
-          <w:noProof/>
-        </w:rPr>
-        <w:t>2</w:t>
-      </w:r>
-      <w:r>
-        <w:rPr>
-          <w:noProof/>
-        </w:rPr>
-        <w:fldChar w:fldCharType="end"/>
-      </w:r>
+      <w:fldSimple w:instr=" SEQ Figure \* ARABIC \s 1 ">
+        <w:r>
+          <w:rPr>
+            <w:noProof/>
+          </w:rPr>
+          <w:t>2</w:t>
+        </w:r>
+      </w:fldSimple>
       <w:r>
         <w:rPr>
           <w:lang w:val="en-US"/>
@@ -13761,58 +13676,32 @@
       <w:r>
         <w:t xml:space="preserve">Figure </w:t>
       </w:r>
-      <w:r>
-        <w:fldChar w:fldCharType="begin"/>
-      </w:r>
-      <w:r>
-        <w:instrText xml:space="preserve"> STYLEREF 1 \s </w:instrText>
-      </w:r>
-      <w:r>
-        <w:fldChar w:fldCharType="separate"/>
-      </w:r>
-      <w:r>
-        <w:rPr>
-          <w:noProof/>
-          <w:cs/>
-        </w:rPr>
-        <w:t>‎</w:t>
-      </w:r>
-      <w:r>
-        <w:rPr>
-          <w:noProof/>
-        </w:rPr>
-        <w:t>3</w:t>
-      </w:r>
-      <w:r>
-        <w:rPr>
-          <w:noProof/>
-        </w:rPr>
-        <w:fldChar w:fldCharType="end"/>
-      </w:r>
+      <w:fldSimple w:instr=" STYLEREF 1 \s ">
+        <w:r>
+          <w:rPr>
+            <w:noProof/>
+            <w:cs/>
+          </w:rPr>
+          <w:t>‎</w:t>
+        </w:r>
+        <w:r>
+          <w:rPr>
+            <w:noProof/>
+          </w:rPr>
+          <w:t>3</w:t>
+        </w:r>
+      </w:fldSimple>
       <w:r>
         <w:t>.</w:t>
       </w:r>
-      <w:r>
-        <w:fldChar w:fldCharType="begin"/>
-      </w:r>
-      <w:r>
-        <w:instrText xml:space="preserve"> SEQ Figure \* ARABIC \s 1 </w:instrText>
-      </w:r>
-      <w:r>
-        <w:fldChar w:fldCharType="separate"/>
-      </w:r>
-      <w:r>
-        <w:rPr>
-          <w:noProof/>
-        </w:rPr>
-        <w:t>3</w:t>
-      </w:r>
-      <w:r>
-        <w:rPr>
-          <w:noProof/>
-        </w:rPr>
-        <w:fldChar w:fldCharType="end"/>
-      </w:r>
+      <w:fldSimple w:instr=" SEQ Figure \* ARABIC \s 1 ">
+        <w:r>
+          <w:rPr>
+            <w:noProof/>
+          </w:rPr>
+          <w:t>3</w:t>
+        </w:r>
+      </w:fldSimple>
       <w:r>
         <w:rPr>
           <w:lang w:val="en-US"/>
@@ -13909,58 +13798,32 @@
       <w:r>
         <w:t xml:space="preserve">Figure </w:t>
       </w:r>
-      <w:r>
-        <w:fldChar w:fldCharType="begin"/>
-      </w:r>
-      <w:r>
-        <w:instrText xml:space="preserve"> STYLEREF 1 \s </w:instrText>
-      </w:r>
-      <w:r>
-        <w:fldChar w:fldCharType="separate"/>
-      </w:r>
-      <w:r>
-        <w:rPr>
-          <w:noProof/>
-          <w:cs/>
-        </w:rPr>
-        <w:t>‎</w:t>
-      </w:r>
-      <w:r>
-        <w:rPr>
-          <w:noProof/>
-        </w:rPr>
-        <w:t>3</w:t>
-      </w:r>
-      <w:r>
-        <w:rPr>
-          <w:noProof/>
-        </w:rPr>
-        <w:fldChar w:fldCharType="end"/>
-      </w:r>
+      <w:fldSimple w:instr=" STYLEREF 1 \s ">
+        <w:r>
+          <w:rPr>
+            <w:noProof/>
+            <w:cs/>
+          </w:rPr>
+          <w:t>‎</w:t>
+        </w:r>
+        <w:r>
+          <w:rPr>
+            <w:noProof/>
+          </w:rPr>
+          <w:t>3</w:t>
+        </w:r>
+      </w:fldSimple>
       <w:r>
         <w:t>.</w:t>
       </w:r>
-      <w:r>
-        <w:fldChar w:fldCharType="begin"/>
-      </w:r>
-      <w:r>
-        <w:instrText xml:space="preserve"> SEQ Figure \* ARABIC \s 1 </w:instrText>
-      </w:r>
-      <w:r>
-        <w:fldChar w:fldCharType="separate"/>
-      </w:r>
-      <w:r>
-        <w:rPr>
-          <w:noProof/>
-        </w:rPr>
-        <w:t>4</w:t>
-      </w:r>
-      <w:r>
-        <w:rPr>
-          <w:noProof/>
-        </w:rPr>
-        <w:fldChar w:fldCharType="end"/>
-      </w:r>
+      <w:fldSimple w:instr=" SEQ Figure \* ARABIC \s 1 ">
+        <w:r>
+          <w:rPr>
+            <w:noProof/>
+          </w:rPr>
+          <w:t>4</w:t>
+        </w:r>
+      </w:fldSimple>
       <w:r>
         <w:rPr>
           <w:lang w:val="en-US"/>
@@ -14074,58 +13937,32 @@
       <w:r>
         <w:t xml:space="preserve">Figure </w:t>
       </w:r>
-      <w:r>
-        <w:fldChar w:fldCharType="begin"/>
-      </w:r>
-      <w:r>
-        <w:instrText xml:space="preserve"> STYLEREF 1 \s </w:instrText>
-      </w:r>
-      <w:r>
-        <w:fldChar w:fldCharType="separate"/>
-      </w:r>
-      <w:r>
-        <w:rPr>
-          <w:noProof/>
-          <w:cs/>
-        </w:rPr>
-        <w:t>‎</w:t>
-      </w:r>
-      <w:r>
-        <w:rPr>
-          <w:noProof/>
-        </w:rPr>
-        <w:t>3</w:t>
-      </w:r>
-      <w:r>
-        <w:rPr>
-          <w:noProof/>
-        </w:rPr>
-        <w:fldChar w:fldCharType="end"/>
-      </w:r>
+      <w:fldSimple w:instr=" STYLEREF 1 \s ">
+        <w:r>
+          <w:rPr>
+            <w:noProof/>
+            <w:cs/>
+          </w:rPr>
+          <w:t>‎</w:t>
+        </w:r>
+        <w:r>
+          <w:rPr>
+            <w:noProof/>
+          </w:rPr>
+          <w:t>3</w:t>
+        </w:r>
+      </w:fldSimple>
       <w:r>
         <w:t>.</w:t>
       </w:r>
-      <w:r>
-        <w:fldChar w:fldCharType="begin"/>
-      </w:r>
-      <w:r>
-        <w:instrText xml:space="preserve"> SEQ Figure \* ARABIC \s 1 </w:instrText>
-      </w:r>
-      <w:r>
-        <w:fldChar w:fldCharType="separate"/>
-      </w:r>
-      <w:r>
-        <w:rPr>
-          <w:noProof/>
-        </w:rPr>
-        <w:t>5</w:t>
-      </w:r>
-      <w:r>
-        <w:rPr>
-          <w:noProof/>
-        </w:rPr>
-        <w:fldChar w:fldCharType="end"/>
-      </w:r>
+      <w:fldSimple w:instr=" SEQ Figure \* ARABIC \s 1 ">
+        <w:r>
+          <w:rPr>
+            <w:noProof/>
+          </w:rPr>
+          <w:t>5</w:t>
+        </w:r>
+      </w:fldSimple>
       <w:r>
         <w:rPr>
           <w:lang w:val="en-US"/>
@@ -14365,58 +14202,32 @@
       <w:r>
         <w:t xml:space="preserve">Figure </w:t>
       </w:r>
-      <w:r>
-        <w:fldChar w:fldCharType="begin"/>
-      </w:r>
-      <w:r>
-        <w:instrText xml:space="preserve"> STYLEREF 1 \s </w:instrText>
-      </w:r>
-      <w:r>
-        <w:fldChar w:fldCharType="separate"/>
-      </w:r>
-      <w:r>
-        <w:rPr>
-          <w:noProof/>
-          <w:cs/>
-        </w:rPr>
-        <w:t>‎</w:t>
-      </w:r>
-      <w:r>
-        <w:rPr>
-          <w:noProof/>
-        </w:rPr>
-        <w:t>3</w:t>
-      </w:r>
-      <w:r>
-        <w:rPr>
-          <w:noProof/>
-        </w:rPr>
-        <w:fldChar w:fldCharType="end"/>
-      </w:r>
+      <w:fldSimple w:instr=" STYLEREF 1 \s ">
+        <w:r>
+          <w:rPr>
+            <w:noProof/>
+            <w:cs/>
+          </w:rPr>
+          <w:t>‎</w:t>
+        </w:r>
+        <w:r>
+          <w:rPr>
+            <w:noProof/>
+          </w:rPr>
+          <w:t>3</w:t>
+        </w:r>
+      </w:fldSimple>
       <w:r>
         <w:t>.</w:t>
       </w:r>
-      <w:r>
-        <w:fldChar w:fldCharType="begin"/>
-      </w:r>
-      <w:r>
-        <w:instrText xml:space="preserve"> SEQ Figure \* ARABIC \s 1 </w:instrText>
-      </w:r>
-      <w:r>
-        <w:fldChar w:fldCharType="separate"/>
-      </w:r>
-      <w:r>
-        <w:rPr>
-          <w:noProof/>
-        </w:rPr>
-        <w:t>6</w:t>
-      </w:r>
-      <w:r>
-        <w:rPr>
-          <w:noProof/>
-        </w:rPr>
-        <w:fldChar w:fldCharType="end"/>
-      </w:r>
+      <w:fldSimple w:instr=" SEQ Figure \* ARABIC \s 1 ">
+        <w:r>
+          <w:rPr>
+            <w:noProof/>
+          </w:rPr>
+          <w:t>6</w:t>
+        </w:r>
+      </w:fldSimple>
       <w:r>
         <w:rPr>
           <w:lang w:val="en-US"/>
@@ -14576,58 +14387,32 @@
       <w:r>
         <w:t xml:space="preserve">Figure </w:t>
       </w:r>
-      <w:r>
-        <w:fldChar w:fldCharType="begin"/>
-      </w:r>
-      <w:r>
-        <w:instrText xml:space="preserve"> STYLEREF 1 \s </w:instrText>
-      </w:r>
-      <w:r>
-        <w:fldChar w:fldCharType="separate"/>
-      </w:r>
-      <w:r>
-        <w:rPr>
-          <w:noProof/>
-          <w:cs/>
-        </w:rPr>
-        <w:t>‎</w:t>
-      </w:r>
-      <w:r>
-        <w:rPr>
-          <w:noProof/>
-        </w:rPr>
-        <w:t>3</w:t>
-      </w:r>
-      <w:r>
-        <w:rPr>
-          <w:noProof/>
-        </w:rPr>
-        <w:fldChar w:fldCharType="end"/>
-      </w:r>
+      <w:fldSimple w:instr=" STYLEREF 1 \s ">
+        <w:r>
+          <w:rPr>
+            <w:noProof/>
+            <w:cs/>
+          </w:rPr>
+          <w:t>‎</w:t>
+        </w:r>
+        <w:r>
+          <w:rPr>
+            <w:noProof/>
+          </w:rPr>
+          <w:t>3</w:t>
+        </w:r>
+      </w:fldSimple>
       <w:r>
         <w:t>.</w:t>
       </w:r>
-      <w:r>
-        <w:fldChar w:fldCharType="begin"/>
-      </w:r>
-      <w:r>
-        <w:instrText xml:space="preserve"> SEQ Figure \* ARABIC \s 1 </w:instrText>
-      </w:r>
-      <w:r>
-        <w:fldChar w:fldCharType="separate"/>
-      </w:r>
-      <w:r>
-        <w:rPr>
-          <w:noProof/>
-        </w:rPr>
-        <w:t>7</w:t>
-      </w:r>
-      <w:r>
-        <w:rPr>
-          <w:noProof/>
-        </w:rPr>
-        <w:fldChar w:fldCharType="end"/>
-      </w:r>
+      <w:fldSimple w:instr=" SEQ Figure \* ARABIC \s 1 ">
+        <w:r>
+          <w:rPr>
+            <w:noProof/>
+          </w:rPr>
+          <w:t>7</w:t>
+        </w:r>
+      </w:fldSimple>
       <w:r>
         <w:rPr>
           <w:lang w:val="en-US"/>
@@ -14771,58 +14556,32 @@
       <w:r>
         <w:t xml:space="preserve">Figure </w:t>
       </w:r>
-      <w:r>
-        <w:fldChar w:fldCharType="begin"/>
-      </w:r>
-      <w:r>
-        <w:instrText xml:space="preserve"> STYLEREF 1 \s </w:instrText>
-      </w:r>
-      <w:r>
-        <w:fldChar w:fldCharType="separate"/>
-      </w:r>
-      <w:r>
-        <w:rPr>
-          <w:noProof/>
-          <w:cs/>
-        </w:rPr>
-        <w:t>‎</w:t>
-      </w:r>
-      <w:r>
-        <w:rPr>
-          <w:noProof/>
-        </w:rPr>
-        <w:t>3</w:t>
-      </w:r>
-      <w:r>
-        <w:rPr>
-          <w:noProof/>
-        </w:rPr>
-        <w:fldChar w:fldCharType="end"/>
-      </w:r>
+      <w:fldSimple w:instr=" STYLEREF 1 \s ">
+        <w:r>
+          <w:rPr>
+            <w:noProof/>
+            <w:cs/>
+          </w:rPr>
+          <w:t>‎</w:t>
+        </w:r>
+        <w:r>
+          <w:rPr>
+            <w:noProof/>
+          </w:rPr>
+          <w:t>3</w:t>
+        </w:r>
+      </w:fldSimple>
       <w:r>
         <w:t>.</w:t>
       </w:r>
-      <w:r>
-        <w:fldChar w:fldCharType="begin"/>
-      </w:r>
-      <w:r>
-        <w:instrText xml:space="preserve"> SEQ Figure \* ARABIC \s 1 </w:instrText>
-      </w:r>
-      <w:r>
-        <w:fldChar w:fldCharType="separate"/>
-      </w:r>
-      <w:r>
-        <w:rPr>
-          <w:noProof/>
-        </w:rPr>
-        <w:t>8</w:t>
-      </w:r>
-      <w:r>
-        <w:rPr>
-          <w:noProof/>
-        </w:rPr>
-        <w:fldChar w:fldCharType="end"/>
-      </w:r>
+      <w:fldSimple w:instr=" SEQ Figure \* ARABIC \s 1 ">
+        <w:r>
+          <w:rPr>
+            <w:noProof/>
+          </w:rPr>
+          <w:t>8</w:t>
+        </w:r>
+      </w:fldSimple>
       <w:r>
         <w:rPr>
           <w:lang w:val="en-US"/>
@@ -15332,58 +15091,32 @@
       <w:r>
         <w:t xml:space="preserve">Figure </w:t>
       </w:r>
-      <w:r>
-        <w:fldChar w:fldCharType="begin"/>
-      </w:r>
-      <w:r>
-        <w:instrText xml:space="preserve"> STYLEREF 1 \s </w:instrText>
-      </w:r>
-      <w:r>
-        <w:fldChar w:fldCharType="separate"/>
-      </w:r>
-      <w:r>
-        <w:rPr>
-          <w:noProof/>
-          <w:cs/>
-        </w:rPr>
-        <w:t>‎</w:t>
-      </w:r>
-      <w:r>
-        <w:rPr>
-          <w:noProof/>
-        </w:rPr>
-        <w:t>3</w:t>
-      </w:r>
-      <w:r>
-        <w:rPr>
-          <w:noProof/>
-        </w:rPr>
-        <w:fldChar w:fldCharType="end"/>
-      </w:r>
+      <w:fldSimple w:instr=" STYLEREF 1 \s ">
+        <w:r>
+          <w:rPr>
+            <w:noProof/>
+            <w:cs/>
+          </w:rPr>
+          <w:t>‎</w:t>
+        </w:r>
+        <w:r>
+          <w:rPr>
+            <w:noProof/>
+          </w:rPr>
+          <w:t>3</w:t>
+        </w:r>
+      </w:fldSimple>
       <w:r>
         <w:t>.</w:t>
       </w:r>
-      <w:r>
-        <w:fldChar w:fldCharType="begin"/>
-      </w:r>
-      <w:r>
-        <w:instrText xml:space="preserve"> SEQ Figure \* ARABIC \s 1 </w:instrText>
-      </w:r>
-      <w:r>
-        <w:fldChar w:fldCharType="separate"/>
-      </w:r>
-      <w:r>
-        <w:rPr>
-          <w:noProof/>
-        </w:rPr>
-        <w:t>9</w:t>
-      </w:r>
-      <w:r>
-        <w:rPr>
-          <w:noProof/>
-        </w:rPr>
-        <w:fldChar w:fldCharType="end"/>
-      </w:r>
+      <w:fldSimple w:instr=" SEQ Figure \* ARABIC \s 1 ">
+        <w:r>
+          <w:rPr>
+            <w:noProof/>
+          </w:rPr>
+          <w:t>9</w:t>
+        </w:r>
+      </w:fldSimple>
       <w:r>
         <w:rPr>
           <w:lang w:val="en-US"/>
@@ -15508,58 +15241,32 @@
       <w:r>
         <w:t xml:space="preserve">Figure </w:t>
       </w:r>
-      <w:r>
-        <w:fldChar w:fldCharType="begin"/>
-      </w:r>
-      <w:r>
-        <w:instrText xml:space="preserve"> STYLEREF 1 \s </w:instrText>
-      </w:r>
-      <w:r>
-        <w:fldChar w:fldCharType="separate"/>
-      </w:r>
-      <w:r>
-        <w:rPr>
-          <w:noProof/>
-          <w:cs/>
-        </w:rPr>
-        <w:t>‎</w:t>
-      </w:r>
-      <w:r>
-        <w:rPr>
-          <w:noProof/>
-        </w:rPr>
-        <w:t>3</w:t>
-      </w:r>
-      <w:r>
-        <w:rPr>
-          <w:noProof/>
-        </w:rPr>
-        <w:fldChar w:fldCharType="end"/>
-      </w:r>
+      <w:fldSimple w:instr=" STYLEREF 1 \s ">
+        <w:r>
+          <w:rPr>
+            <w:noProof/>
+            <w:cs/>
+          </w:rPr>
+          <w:t>‎</w:t>
+        </w:r>
+        <w:r>
+          <w:rPr>
+            <w:noProof/>
+          </w:rPr>
+          <w:t>3</w:t>
+        </w:r>
+      </w:fldSimple>
       <w:r>
         <w:t>.</w:t>
       </w:r>
-      <w:r>
-        <w:fldChar w:fldCharType="begin"/>
-      </w:r>
-      <w:r>
-        <w:instrText xml:space="preserve"> SEQ Figure \* ARABIC \s 1 </w:instrText>
-      </w:r>
-      <w:r>
-        <w:fldChar w:fldCharType="separate"/>
-      </w:r>
-      <w:r>
-        <w:rPr>
-          <w:noProof/>
-        </w:rPr>
-        <w:t>10</w:t>
-      </w:r>
-      <w:r>
-        <w:rPr>
-          <w:noProof/>
-        </w:rPr>
-        <w:fldChar w:fldCharType="end"/>
-      </w:r>
+      <w:fldSimple w:instr=" SEQ Figure \* ARABIC \s 1 ">
+        <w:r>
+          <w:rPr>
+            <w:noProof/>
+          </w:rPr>
+          <w:t>10</w:t>
+        </w:r>
+      </w:fldSimple>
       <w:r>
         <w:rPr>
           <w:lang w:val="en-US"/>
@@ -15940,58 +15647,32 @@
       <w:r>
         <w:t xml:space="preserve">Figure </w:t>
       </w:r>
-      <w:r>
-        <w:fldChar w:fldCharType="begin"/>
-      </w:r>
-      <w:r>
-        <w:instrText xml:space="preserve"> STYLEREF 1 \s </w:instrText>
-      </w:r>
-      <w:r>
-        <w:fldChar w:fldCharType="separate"/>
-      </w:r>
-      <w:r>
-        <w:rPr>
-          <w:noProof/>
-          <w:cs/>
-        </w:rPr>
-        <w:t>‎</w:t>
-      </w:r>
-      <w:r>
-        <w:rPr>
-          <w:noProof/>
-        </w:rPr>
-        <w:t>3</w:t>
-      </w:r>
-      <w:r>
-        <w:rPr>
-          <w:noProof/>
-        </w:rPr>
-        <w:fldChar w:fldCharType="end"/>
-      </w:r>
+      <w:fldSimple w:instr=" STYLEREF 1 \s ">
+        <w:r>
+          <w:rPr>
+            <w:noProof/>
+            <w:cs/>
+          </w:rPr>
+          <w:t>‎</w:t>
+        </w:r>
+        <w:r>
+          <w:rPr>
+            <w:noProof/>
+          </w:rPr>
+          <w:t>3</w:t>
+        </w:r>
+      </w:fldSimple>
       <w:r>
         <w:t>.</w:t>
       </w:r>
-      <w:r>
-        <w:fldChar w:fldCharType="begin"/>
-      </w:r>
-      <w:r>
-        <w:instrText xml:space="preserve"> SEQ Figure \* ARABIC \s 1 </w:instrText>
-      </w:r>
-      <w:r>
-        <w:fldChar w:fldCharType="separate"/>
-      </w:r>
-      <w:r>
-        <w:rPr>
-          <w:noProof/>
-        </w:rPr>
-        <w:t>11</w:t>
-      </w:r>
-      <w:r>
-        <w:rPr>
-          <w:noProof/>
-        </w:rPr>
-        <w:fldChar w:fldCharType="end"/>
-      </w:r>
+      <w:fldSimple w:instr=" SEQ Figure \* ARABIC \s 1 ">
+        <w:r>
+          <w:rPr>
+            <w:noProof/>
+          </w:rPr>
+          <w:t>11</w:t>
+        </w:r>
+      </w:fldSimple>
       <w:r>
         <w:rPr>
           <w:lang w:val="en-US"/>
@@ -16259,58 +15940,32 @@
       <w:r>
         <w:t xml:space="preserve">Figure </w:t>
       </w:r>
-      <w:r>
-        <w:fldChar w:fldCharType="begin"/>
-      </w:r>
-      <w:r>
-        <w:instrText xml:space="preserve"> STYLEREF 1 \s </w:instrText>
-      </w:r>
-      <w:r>
-        <w:fldChar w:fldCharType="separate"/>
-      </w:r>
-      <w:r>
-        <w:rPr>
-          <w:noProof/>
-          <w:cs/>
-        </w:rPr>
-        <w:t>‎</w:t>
-      </w:r>
-      <w:r>
-        <w:rPr>
-          <w:noProof/>
-        </w:rPr>
-        <w:t>4</w:t>
-      </w:r>
-      <w:r>
-        <w:rPr>
-          <w:noProof/>
-        </w:rPr>
-        <w:fldChar w:fldCharType="end"/>
-      </w:r>
+      <w:fldSimple w:instr=" STYLEREF 1 \s ">
+        <w:r>
+          <w:rPr>
+            <w:noProof/>
+            <w:cs/>
+          </w:rPr>
+          <w:t>‎</w:t>
+        </w:r>
+        <w:r>
+          <w:rPr>
+            <w:noProof/>
+          </w:rPr>
+          <w:t>4</w:t>
+        </w:r>
+      </w:fldSimple>
       <w:r>
         <w:t>.</w:t>
       </w:r>
-      <w:r>
-        <w:fldChar w:fldCharType="begin"/>
-      </w:r>
-      <w:r>
-        <w:instrText xml:space="preserve"> SEQ Figure \* ARABIC \s 1 </w:instrText>
-      </w:r>
-      <w:r>
-        <w:fldChar w:fldCharType="separate"/>
-      </w:r>
-      <w:r>
-        <w:rPr>
-          <w:noProof/>
-        </w:rPr>
-        <w:t>1</w:t>
-      </w:r>
-      <w:r>
-        <w:rPr>
-          <w:noProof/>
-        </w:rPr>
-        <w:fldChar w:fldCharType="end"/>
-      </w:r>
+      <w:fldSimple w:instr=" SEQ Figure \* ARABIC \s 1 ">
+        <w:r>
+          <w:rPr>
+            <w:noProof/>
+          </w:rPr>
+          <w:t>1</w:t>
+        </w:r>
+      </w:fldSimple>
       <w:r>
         <w:rPr>
           <w:lang w:val="en-US"/>
@@ -16425,58 +16080,32 @@
       <w:r>
         <w:t xml:space="preserve">Figure </w:t>
       </w:r>
-      <w:r>
-        <w:fldChar w:fldCharType="begin"/>
-      </w:r>
-      <w:r>
-        <w:instrText xml:space="preserve"> STYLEREF 1 \s </w:instrText>
-      </w:r>
-      <w:r>
-        <w:fldChar w:fldCharType="separate"/>
-      </w:r>
-      <w:r>
-        <w:rPr>
-          <w:noProof/>
-          <w:cs/>
-        </w:rPr>
-        <w:t>‎</w:t>
-      </w:r>
-      <w:r>
-        <w:rPr>
-          <w:noProof/>
-        </w:rPr>
-        <w:t>4</w:t>
-      </w:r>
-      <w:r>
-        <w:rPr>
-          <w:noProof/>
-        </w:rPr>
-        <w:fldChar w:fldCharType="end"/>
-      </w:r>
+      <w:fldSimple w:instr=" STYLEREF 1 \s ">
+        <w:r>
+          <w:rPr>
+            <w:noProof/>
+            <w:cs/>
+          </w:rPr>
+          <w:t>‎</w:t>
+        </w:r>
+        <w:r>
+          <w:rPr>
+            <w:noProof/>
+          </w:rPr>
+          <w:t>4</w:t>
+        </w:r>
+      </w:fldSimple>
       <w:r>
         <w:t>.</w:t>
       </w:r>
-      <w:r>
-        <w:fldChar w:fldCharType="begin"/>
-      </w:r>
-      <w:r>
-        <w:instrText xml:space="preserve"> SEQ Figure \* ARABIC \s 1 </w:instrText>
-      </w:r>
-      <w:r>
-        <w:fldChar w:fldCharType="separate"/>
-      </w:r>
-      <w:r>
-        <w:rPr>
-          <w:noProof/>
-        </w:rPr>
-        <w:t>2</w:t>
-      </w:r>
-      <w:r>
-        <w:rPr>
-          <w:noProof/>
-        </w:rPr>
-        <w:fldChar w:fldCharType="end"/>
-      </w:r>
+      <w:fldSimple w:instr=" SEQ Figure \* ARABIC \s 1 ">
+        <w:r>
+          <w:rPr>
+            <w:noProof/>
+          </w:rPr>
+          <w:t>2</w:t>
+        </w:r>
+      </w:fldSimple>
       <w:r>
         <w:rPr>
           <w:lang w:val="en-US"/>
@@ -16595,58 +16224,32 @@
       <w:r>
         <w:t xml:space="preserve">Figure </w:t>
       </w:r>
-      <w:r>
-        <w:fldChar w:fldCharType="begin"/>
-      </w:r>
-      <w:r>
-        <w:instrText xml:space="preserve"> STYLEREF 1 \s </w:instrText>
-      </w:r>
-      <w:r>
-        <w:fldChar w:fldCharType="separate"/>
-      </w:r>
-      <w:r>
-        <w:rPr>
-          <w:noProof/>
-          <w:cs/>
-        </w:rPr>
-        <w:t>‎</w:t>
-      </w:r>
-      <w:r>
-        <w:rPr>
-          <w:noProof/>
-        </w:rPr>
-        <w:t>4</w:t>
-      </w:r>
-      <w:r>
-        <w:rPr>
-          <w:noProof/>
-        </w:rPr>
-        <w:fldChar w:fldCharType="end"/>
-      </w:r>
+      <w:fldSimple w:instr=" STYLEREF 1 \s ">
+        <w:r>
+          <w:rPr>
+            <w:noProof/>
+            <w:cs/>
+          </w:rPr>
+          <w:t>‎</w:t>
+        </w:r>
+        <w:r>
+          <w:rPr>
+            <w:noProof/>
+          </w:rPr>
+          <w:t>4</w:t>
+        </w:r>
+      </w:fldSimple>
       <w:r>
         <w:t>.</w:t>
       </w:r>
-      <w:r>
-        <w:fldChar w:fldCharType="begin"/>
-      </w:r>
-      <w:r>
-        <w:instrText xml:space="preserve"> SEQ Figure \* ARABIC \s 1 </w:instrText>
-      </w:r>
-      <w:r>
-        <w:fldChar w:fldCharType="separate"/>
-      </w:r>
-      <w:r>
-        <w:rPr>
-          <w:noProof/>
-        </w:rPr>
-        <w:t>3</w:t>
-      </w:r>
-      <w:r>
-        <w:rPr>
-          <w:noProof/>
-        </w:rPr>
-        <w:fldChar w:fldCharType="end"/>
-      </w:r>
+      <w:fldSimple w:instr=" SEQ Figure \* ARABIC \s 1 ">
+        <w:r>
+          <w:rPr>
+            <w:noProof/>
+          </w:rPr>
+          <w:t>3</w:t>
+        </w:r>
+      </w:fldSimple>
       <w:r>
         <w:rPr>
           <w:lang w:val="en-US"/>
@@ -16760,58 +16363,32 @@
       <w:r>
         <w:t xml:space="preserve">Figure </w:t>
       </w:r>
-      <w:r>
-        <w:fldChar w:fldCharType="begin"/>
-      </w:r>
-      <w:r>
-        <w:instrText xml:space="preserve"> STYLEREF 1 \s </w:instrText>
-      </w:r>
-      <w:r>
-        <w:fldChar w:fldCharType="separate"/>
-      </w:r>
-      <w:r>
-        <w:rPr>
-          <w:noProof/>
-          <w:cs/>
-        </w:rPr>
-        <w:t>‎</w:t>
-      </w:r>
-      <w:r>
-        <w:rPr>
-          <w:noProof/>
-        </w:rPr>
-        <w:t>4</w:t>
-      </w:r>
-      <w:r>
-        <w:rPr>
-          <w:noProof/>
-        </w:rPr>
-        <w:fldChar w:fldCharType="end"/>
-      </w:r>
+      <w:fldSimple w:instr=" STYLEREF 1 \s ">
+        <w:r>
+          <w:rPr>
+            <w:noProof/>
+            <w:cs/>
+          </w:rPr>
+          <w:t>‎</w:t>
+        </w:r>
+        <w:r>
+          <w:rPr>
+            <w:noProof/>
+          </w:rPr>
+          <w:t>4</w:t>
+        </w:r>
+      </w:fldSimple>
       <w:r>
         <w:t>.</w:t>
       </w:r>
-      <w:r>
-        <w:fldChar w:fldCharType="begin"/>
-      </w:r>
-      <w:r>
-        <w:instrText xml:space="preserve"> SEQ Figure \* ARABIC \s 1 </w:instrText>
-      </w:r>
-      <w:r>
-        <w:fldChar w:fldCharType="separate"/>
-      </w:r>
-      <w:r>
-        <w:rPr>
-          <w:noProof/>
-        </w:rPr>
-        <w:t>4</w:t>
-      </w:r>
-      <w:r>
-        <w:rPr>
-          <w:noProof/>
-        </w:rPr>
-        <w:fldChar w:fldCharType="end"/>
-      </w:r>
+      <w:fldSimple w:instr=" SEQ Figure \* ARABIC \s 1 ">
+        <w:r>
+          <w:rPr>
+            <w:noProof/>
+          </w:rPr>
+          <w:t>4</w:t>
+        </w:r>
+      </w:fldSimple>
       <w:r>
         <w:rPr>
           <w:lang w:val="en-US"/>
@@ -16954,58 +16531,32 @@
       <w:r>
         <w:t xml:space="preserve">Figure </w:t>
       </w:r>
-      <w:r>
-        <w:fldChar w:fldCharType="begin"/>
-      </w:r>
-      <w:r>
-        <w:instrText xml:space="preserve"> STYLEREF 1 \s </w:instrText>
-      </w:r>
-      <w:r>
-        <w:fldChar w:fldCharType="separate"/>
-      </w:r>
-      <w:r>
-        <w:rPr>
-          <w:noProof/>
-          <w:cs/>
-        </w:rPr>
-        <w:t>‎</w:t>
-      </w:r>
-      <w:r>
-        <w:rPr>
-          <w:noProof/>
-        </w:rPr>
-        <w:t>4</w:t>
-      </w:r>
-      <w:r>
-        <w:rPr>
-          <w:noProof/>
-        </w:rPr>
-        <w:fldChar w:fldCharType="end"/>
-      </w:r>
+      <w:fldSimple w:instr=" STYLEREF 1 \s ">
+        <w:r>
+          <w:rPr>
+            <w:noProof/>
+            <w:cs/>
+          </w:rPr>
+          <w:t>‎</w:t>
+        </w:r>
+        <w:r>
+          <w:rPr>
+            <w:noProof/>
+          </w:rPr>
+          <w:t>4</w:t>
+        </w:r>
+      </w:fldSimple>
       <w:r>
         <w:t>.</w:t>
       </w:r>
-      <w:r>
-        <w:fldChar w:fldCharType="begin"/>
-      </w:r>
-      <w:r>
-        <w:instrText xml:space="preserve"> SEQ Figure \* ARABIC \s 1 </w:instrText>
-      </w:r>
-      <w:r>
-        <w:fldChar w:fldCharType="separate"/>
-      </w:r>
-      <w:r>
-        <w:rPr>
-          <w:noProof/>
-        </w:rPr>
-        <w:t>5</w:t>
-      </w:r>
-      <w:r>
-        <w:rPr>
-          <w:noProof/>
-        </w:rPr>
-        <w:fldChar w:fldCharType="end"/>
-      </w:r>
+      <w:fldSimple w:instr=" SEQ Figure \* ARABIC \s 1 ">
+        <w:r>
+          <w:rPr>
+            <w:noProof/>
+          </w:rPr>
+          <w:t>5</w:t>
+        </w:r>
+      </w:fldSimple>
       <w:r>
         <w:rPr>
           <w:lang w:val="en-US"/>
@@ -17267,58 +16818,32 @@
       <w:r>
         <w:t xml:space="preserve">Figure </w:t>
       </w:r>
-      <w:r>
-        <w:fldChar w:fldCharType="begin"/>
-      </w:r>
-      <w:r>
-        <w:instrText xml:space="preserve"> STYLEREF 1 \s </w:instrText>
-      </w:r>
-      <w:r>
-        <w:fldChar w:fldCharType="separate"/>
-      </w:r>
-      <w:r>
-        <w:rPr>
-          <w:noProof/>
-          <w:cs/>
-        </w:rPr>
-        <w:t>‎</w:t>
-      </w:r>
-      <w:r>
-        <w:rPr>
-          <w:noProof/>
-        </w:rPr>
-        <w:t>4</w:t>
-      </w:r>
-      <w:r>
-        <w:rPr>
-          <w:noProof/>
-        </w:rPr>
-        <w:fldChar w:fldCharType="end"/>
-      </w:r>
+      <w:fldSimple w:instr=" STYLEREF 1 \s ">
+        <w:r>
+          <w:rPr>
+            <w:noProof/>
+            <w:cs/>
+          </w:rPr>
+          <w:t>‎</w:t>
+        </w:r>
+        <w:r>
+          <w:rPr>
+            <w:noProof/>
+          </w:rPr>
+          <w:t>4</w:t>
+        </w:r>
+      </w:fldSimple>
       <w:r>
         <w:t>.</w:t>
       </w:r>
-      <w:r>
-        <w:fldChar w:fldCharType="begin"/>
-      </w:r>
-      <w:r>
-        <w:instrText xml:space="preserve"> SEQ Figure \* ARABIC \s 1 </w:instrText>
-      </w:r>
-      <w:r>
-        <w:fldChar w:fldCharType="separate"/>
-      </w:r>
-      <w:r>
-        <w:rPr>
-          <w:noProof/>
-        </w:rPr>
-        <w:t>6</w:t>
-      </w:r>
-      <w:r>
-        <w:rPr>
-          <w:noProof/>
-        </w:rPr>
-        <w:fldChar w:fldCharType="end"/>
-      </w:r>
+      <w:fldSimple w:instr=" SEQ Figure \* ARABIC \s 1 ">
+        <w:r>
+          <w:rPr>
+            <w:noProof/>
+          </w:rPr>
+          <w:t>6</w:t>
+        </w:r>
+      </w:fldSimple>
       <w:r>
         <w:rPr>
           <w:lang w:val="en-US"/>
@@ -17526,58 +17051,32 @@
       <w:r>
         <w:t xml:space="preserve">Figure </w:t>
       </w:r>
-      <w:r>
-        <w:fldChar w:fldCharType="begin"/>
-      </w:r>
-      <w:r>
-        <w:instrText xml:space="preserve"> STYLEREF 1 \s </w:instrText>
-      </w:r>
-      <w:r>
-        <w:fldChar w:fldCharType="separate"/>
-      </w:r>
-      <w:r>
-        <w:rPr>
-          <w:noProof/>
-          <w:cs/>
-        </w:rPr>
-        <w:t>‎</w:t>
-      </w:r>
-      <w:r>
-        <w:rPr>
-          <w:noProof/>
-        </w:rPr>
-        <w:t>4</w:t>
-      </w:r>
-      <w:r>
-        <w:rPr>
-          <w:noProof/>
-        </w:rPr>
-        <w:fldChar w:fldCharType="end"/>
-      </w:r>
+      <w:fldSimple w:instr=" STYLEREF 1 \s ">
+        <w:r>
+          <w:rPr>
+            <w:noProof/>
+            <w:cs/>
+          </w:rPr>
+          <w:t>‎</w:t>
+        </w:r>
+        <w:r>
+          <w:rPr>
+            <w:noProof/>
+          </w:rPr>
+          <w:t>4</w:t>
+        </w:r>
+      </w:fldSimple>
       <w:r>
         <w:t>.</w:t>
       </w:r>
-      <w:r>
-        <w:fldChar w:fldCharType="begin"/>
-      </w:r>
-      <w:r>
-        <w:instrText xml:space="preserve"> SEQ Figure \* ARABIC \s 1 </w:instrText>
-      </w:r>
-      <w:r>
-        <w:fldChar w:fldCharType="separate"/>
-      </w:r>
-      <w:r>
-        <w:rPr>
-          <w:noProof/>
-        </w:rPr>
-        <w:t>7</w:t>
-      </w:r>
-      <w:r>
-        <w:rPr>
-          <w:noProof/>
-        </w:rPr>
-        <w:fldChar w:fldCharType="end"/>
-      </w:r>
+      <w:fldSimple w:instr=" SEQ Figure \* ARABIC \s 1 ">
+        <w:r>
+          <w:rPr>
+            <w:noProof/>
+          </w:rPr>
+          <w:t>7</w:t>
+        </w:r>
+      </w:fldSimple>
       <w:r>
         <w:rPr>
           <w:lang w:val="en-US"/>
@@ -17871,58 +17370,32 @@
       <w:r>
         <w:t xml:space="preserve">Figure </w:t>
       </w:r>
-      <w:r>
-        <w:fldChar w:fldCharType="begin"/>
-      </w:r>
-      <w:r>
-        <w:instrText xml:space="preserve"> STYLEREF 1 \s </w:instrText>
-      </w:r>
-      <w:r>
-        <w:fldChar w:fldCharType="separate"/>
-      </w:r>
-      <w:r>
-        <w:rPr>
-          <w:noProof/>
-          <w:cs/>
-        </w:rPr>
-        <w:t>‎</w:t>
-      </w:r>
-      <w:r>
-        <w:rPr>
-          <w:noProof/>
-        </w:rPr>
-        <w:t>4</w:t>
-      </w:r>
-      <w:r>
-        <w:rPr>
-          <w:noProof/>
-        </w:rPr>
-        <w:fldChar w:fldCharType="end"/>
-      </w:r>
+      <w:fldSimple w:instr=" STYLEREF 1 \s ">
+        <w:r>
+          <w:rPr>
+            <w:noProof/>
+            <w:cs/>
+          </w:rPr>
+          <w:t>‎</w:t>
+        </w:r>
+        <w:r>
+          <w:rPr>
+            <w:noProof/>
+          </w:rPr>
+          <w:t>4</w:t>
+        </w:r>
+      </w:fldSimple>
       <w:r>
         <w:t>.</w:t>
       </w:r>
-      <w:r>
-        <w:fldChar w:fldCharType="begin"/>
-      </w:r>
-      <w:r>
-        <w:instrText xml:space="preserve"> SEQ Figure \* ARABIC \s 1 </w:instrText>
-      </w:r>
-      <w:r>
-        <w:fldChar w:fldCharType="separate"/>
-      </w:r>
-      <w:r>
-        <w:rPr>
-          <w:noProof/>
-        </w:rPr>
-        <w:t>8</w:t>
-      </w:r>
-      <w:r>
-        <w:rPr>
-          <w:noProof/>
-        </w:rPr>
-        <w:fldChar w:fldCharType="end"/>
-      </w:r>
+      <w:fldSimple w:instr=" SEQ Figure \* ARABIC \s 1 ">
+        <w:r>
+          <w:rPr>
+            <w:noProof/>
+          </w:rPr>
+          <w:t>8</w:t>
+        </w:r>
+      </w:fldSimple>
       <w:r>
         <w:rPr>
           <w:lang w:val="en-US"/>
@@ -18079,58 +17552,32 @@
       <w:r>
         <w:t xml:space="preserve">Figure </w:t>
       </w:r>
-      <w:r>
-        <w:fldChar w:fldCharType="begin"/>
-      </w:r>
-      <w:r>
-        <w:instrText xml:space="preserve"> STYLEREF 1 \s </w:instrText>
-      </w:r>
-      <w:r>
-        <w:fldChar w:fldCharType="separate"/>
-      </w:r>
-      <w:r>
-        <w:rPr>
-          <w:noProof/>
-          <w:cs/>
-        </w:rPr>
-        <w:t>‎</w:t>
-      </w:r>
-      <w:r>
-        <w:rPr>
-          <w:noProof/>
-        </w:rPr>
-        <w:t>4</w:t>
-      </w:r>
-      <w:r>
-        <w:rPr>
-          <w:noProof/>
-        </w:rPr>
-        <w:fldChar w:fldCharType="end"/>
-      </w:r>
+      <w:fldSimple w:instr=" STYLEREF 1 \s ">
+        <w:r>
+          <w:rPr>
+            <w:noProof/>
+            <w:cs/>
+          </w:rPr>
+          <w:t>‎</w:t>
+        </w:r>
+        <w:r>
+          <w:rPr>
+            <w:noProof/>
+          </w:rPr>
+          <w:t>4</w:t>
+        </w:r>
+      </w:fldSimple>
       <w:r>
         <w:t>.</w:t>
       </w:r>
-      <w:r>
-        <w:fldChar w:fldCharType="begin"/>
-      </w:r>
-      <w:r>
-        <w:instrText xml:space="preserve"> SEQ Figure \* ARABIC \s 1 </w:instrText>
-      </w:r>
-      <w:r>
-        <w:fldChar w:fldCharType="separate"/>
-      </w:r>
-      <w:r>
-        <w:rPr>
-          <w:noProof/>
-        </w:rPr>
-        <w:t>9</w:t>
-      </w:r>
-      <w:r>
-        <w:rPr>
-          <w:noProof/>
-        </w:rPr>
-        <w:fldChar w:fldCharType="end"/>
-      </w:r>
+      <w:fldSimple w:instr=" SEQ Figure \* ARABIC \s 1 ">
+        <w:r>
+          <w:rPr>
+            <w:noProof/>
+          </w:rPr>
+          <w:t>9</w:t>
+        </w:r>
+      </w:fldSimple>
       <w:r>
         <w:rPr>
           <w:lang w:val="en-US"/>
@@ -18342,58 +17789,32 @@
       <w:r>
         <w:t xml:space="preserve">Figure </w:t>
       </w:r>
-      <w:r>
-        <w:fldChar w:fldCharType="begin"/>
-      </w:r>
-      <w:r>
-        <w:instrText xml:space="preserve"> STYLEREF 1 \s </w:instrText>
-      </w:r>
-      <w:r>
-        <w:fldChar w:fldCharType="separate"/>
-      </w:r>
-      <w:r>
-        <w:rPr>
-          <w:noProof/>
-          <w:cs/>
-        </w:rPr>
-        <w:t>‎</w:t>
-      </w:r>
-      <w:r>
-        <w:rPr>
-          <w:noProof/>
-        </w:rPr>
-        <w:t>4</w:t>
-      </w:r>
-      <w:r>
-        <w:rPr>
-          <w:noProof/>
-        </w:rPr>
-        <w:fldChar w:fldCharType="end"/>
-      </w:r>
+      <w:fldSimple w:instr=" STYLEREF 1 \s ">
+        <w:r>
+          <w:rPr>
+            <w:noProof/>
+            <w:cs/>
+          </w:rPr>
+          <w:t>‎</w:t>
+        </w:r>
+        <w:r>
+          <w:rPr>
+            <w:noProof/>
+          </w:rPr>
+          <w:t>4</w:t>
+        </w:r>
+      </w:fldSimple>
       <w:r>
         <w:t>.</w:t>
       </w:r>
-      <w:r>
-        <w:fldChar w:fldCharType="begin"/>
-      </w:r>
-      <w:r>
-        <w:instrText xml:space="preserve"> SEQ Figure \* ARABIC \s 1 </w:instrText>
-      </w:r>
-      <w:r>
-        <w:fldChar w:fldCharType="separate"/>
-      </w:r>
-      <w:r>
-        <w:rPr>
-          <w:noProof/>
-        </w:rPr>
-        <w:t>10</w:t>
-      </w:r>
-      <w:r>
-        <w:rPr>
-          <w:noProof/>
-        </w:rPr>
-        <w:fldChar w:fldCharType="end"/>
-      </w:r>
+      <w:fldSimple w:instr=" SEQ Figure \* ARABIC \s 1 ">
+        <w:r>
+          <w:rPr>
+            <w:noProof/>
+          </w:rPr>
+          <w:t>10</w:t>
+        </w:r>
+      </w:fldSimple>
       <w:r>
         <w:rPr>
           <w:lang w:val="en-US"/>
@@ -18761,58 +18182,32 @@
       <w:r>
         <w:t xml:space="preserve">Figure </w:t>
       </w:r>
-      <w:r>
-        <w:fldChar w:fldCharType="begin"/>
-      </w:r>
-      <w:r>
-        <w:instrText xml:space="preserve"> STYLEREF 1 \s </w:instrText>
-      </w:r>
-      <w:r>
-        <w:fldChar w:fldCharType="separate"/>
-      </w:r>
-      <w:r>
-        <w:rPr>
-          <w:noProof/>
-          <w:cs/>
-        </w:rPr>
-        <w:t>‎</w:t>
-      </w:r>
-      <w:r>
-        <w:rPr>
-          <w:noProof/>
-        </w:rPr>
-        <w:t>4</w:t>
-      </w:r>
-      <w:r>
-        <w:rPr>
-          <w:noProof/>
-        </w:rPr>
-        <w:fldChar w:fldCharType="end"/>
-      </w:r>
+      <w:fldSimple w:instr=" STYLEREF 1 \s ">
+        <w:r>
+          <w:rPr>
+            <w:noProof/>
+            <w:cs/>
+          </w:rPr>
+          <w:t>‎</w:t>
+        </w:r>
+        <w:r>
+          <w:rPr>
+            <w:noProof/>
+          </w:rPr>
+          <w:t>4</w:t>
+        </w:r>
+      </w:fldSimple>
       <w:r>
         <w:t>.</w:t>
       </w:r>
-      <w:r>
-        <w:fldChar w:fldCharType="begin"/>
-      </w:r>
-      <w:r>
-        <w:instrText xml:space="preserve"> SEQ Figure \* ARABIC \s 1 </w:instrText>
-      </w:r>
-      <w:r>
-        <w:fldChar w:fldCharType="separate"/>
-      </w:r>
-      <w:r>
-        <w:rPr>
-          <w:noProof/>
-        </w:rPr>
-        <w:t>11</w:t>
-      </w:r>
-      <w:r>
-        <w:rPr>
-          <w:noProof/>
-        </w:rPr>
-        <w:fldChar w:fldCharType="end"/>
-      </w:r>
+      <w:fldSimple w:instr=" SEQ Figure \* ARABIC \s 1 ">
+        <w:r>
+          <w:rPr>
+            <w:noProof/>
+          </w:rPr>
+          <w:t>11</w:t>
+        </w:r>
+      </w:fldSimple>
       <w:r>
         <w:rPr>
           <w:lang w:val="en-US"/>
@@ -18971,58 +18366,32 @@
       <w:r>
         <w:t xml:space="preserve">Figure </w:t>
       </w:r>
-      <w:r>
-        <w:fldChar w:fldCharType="begin"/>
-      </w:r>
-      <w:r>
-        <w:instrText xml:space="preserve"> STYLEREF 1 \s </w:instrText>
-      </w:r>
-      <w:r>
-        <w:fldChar w:fldCharType="separate"/>
-      </w:r>
-      <w:r>
-        <w:rPr>
-          <w:noProof/>
-          <w:cs/>
-        </w:rPr>
-        <w:t>‎</w:t>
-      </w:r>
-      <w:r>
-        <w:rPr>
-          <w:noProof/>
-        </w:rPr>
-        <w:t>4</w:t>
-      </w:r>
-      <w:r>
-        <w:rPr>
-          <w:noProof/>
-        </w:rPr>
-        <w:fldChar w:fldCharType="end"/>
-      </w:r>
+      <w:fldSimple w:instr=" STYLEREF 1 \s ">
+        <w:r>
+          <w:rPr>
+            <w:noProof/>
+            <w:cs/>
+          </w:rPr>
+          <w:t>‎</w:t>
+        </w:r>
+        <w:r>
+          <w:rPr>
+            <w:noProof/>
+          </w:rPr>
+          <w:t>4</w:t>
+        </w:r>
+      </w:fldSimple>
       <w:r>
         <w:t>.</w:t>
       </w:r>
-      <w:r>
-        <w:fldChar w:fldCharType="begin"/>
-      </w:r>
-      <w:r>
-        <w:instrText xml:space="preserve"> SEQ Figure \* ARABIC \s 1 </w:instrText>
-      </w:r>
-      <w:r>
-        <w:fldChar w:fldCharType="separate"/>
-      </w:r>
-      <w:r>
-        <w:rPr>
-          <w:noProof/>
-        </w:rPr>
-        <w:t>12</w:t>
-      </w:r>
-      <w:r>
-        <w:rPr>
-          <w:noProof/>
-        </w:rPr>
-        <w:fldChar w:fldCharType="end"/>
-      </w:r>
+      <w:fldSimple w:instr=" SEQ Figure \* ARABIC \s 1 ">
+        <w:r>
+          <w:rPr>
+            <w:noProof/>
+          </w:rPr>
+          <w:t>12</w:t>
+        </w:r>
+      </w:fldSimple>
       <w:r>
         <w:rPr>
           <w:lang w:val="en-US"/>
@@ -19136,58 +18505,32 @@
       <w:r>
         <w:t xml:space="preserve">Figure </w:t>
       </w:r>
-      <w:r>
-        <w:fldChar w:fldCharType="begin"/>
-      </w:r>
-      <w:r>
-        <w:instrText xml:space="preserve"> STYLEREF 1 \s </w:instrText>
-      </w:r>
-      <w:r>
-        <w:fldChar w:fldCharType="separate"/>
-      </w:r>
-      <w:r>
-        <w:rPr>
-          <w:noProof/>
-          <w:cs/>
-        </w:rPr>
-        <w:t>‎</w:t>
-      </w:r>
-      <w:r>
-        <w:rPr>
-          <w:noProof/>
-        </w:rPr>
-        <w:t>4</w:t>
-      </w:r>
-      <w:r>
-        <w:rPr>
-          <w:noProof/>
-        </w:rPr>
-        <w:fldChar w:fldCharType="end"/>
-      </w:r>
+      <w:fldSimple w:instr=" STYLEREF 1 \s ">
+        <w:r>
+          <w:rPr>
+            <w:noProof/>
+            <w:cs/>
+          </w:rPr>
+          <w:t>‎</w:t>
+        </w:r>
+        <w:r>
+          <w:rPr>
+            <w:noProof/>
+          </w:rPr>
+          <w:t>4</w:t>
+        </w:r>
+      </w:fldSimple>
       <w:r>
         <w:t>.</w:t>
       </w:r>
-      <w:r>
-        <w:fldChar w:fldCharType="begin"/>
-      </w:r>
-      <w:r>
-        <w:instrText xml:space="preserve"> SEQ Figure \* ARABIC \s 1 </w:instrText>
-      </w:r>
-      <w:r>
-        <w:fldChar w:fldCharType="separate"/>
-      </w:r>
-      <w:r>
-        <w:rPr>
-          <w:noProof/>
-        </w:rPr>
-        <w:t>13</w:t>
-      </w:r>
-      <w:r>
-        <w:rPr>
-          <w:noProof/>
-        </w:rPr>
-        <w:fldChar w:fldCharType="end"/>
-      </w:r>
+      <w:fldSimple w:instr=" SEQ Figure \* ARABIC \s 1 ">
+        <w:r>
+          <w:rPr>
+            <w:noProof/>
+          </w:rPr>
+          <w:t>13</w:t>
+        </w:r>
+      </w:fldSimple>
       <w:r>
         <w:rPr>
           <w:lang w:val="en-US"/>
@@ -19292,58 +18635,32 @@
       <w:r>
         <w:t xml:space="preserve">Figure </w:t>
       </w:r>
-      <w:r>
-        <w:fldChar w:fldCharType="begin"/>
-      </w:r>
-      <w:r>
-        <w:instrText xml:space="preserve"> STYLEREF 1 \s </w:instrText>
-      </w:r>
-      <w:r>
-        <w:fldChar w:fldCharType="separate"/>
-      </w:r>
-      <w:r>
-        <w:rPr>
-          <w:noProof/>
-          <w:cs/>
-        </w:rPr>
-        <w:t>‎</w:t>
-      </w:r>
-      <w:r>
-        <w:rPr>
-          <w:noProof/>
-        </w:rPr>
-        <w:t>4</w:t>
-      </w:r>
-      <w:r>
-        <w:rPr>
-          <w:noProof/>
-        </w:rPr>
-        <w:fldChar w:fldCharType="end"/>
-      </w:r>
+      <w:fldSimple w:instr=" STYLEREF 1 \s ">
+        <w:r>
+          <w:rPr>
+            <w:noProof/>
+            <w:cs/>
+          </w:rPr>
+          <w:t>‎</w:t>
+        </w:r>
+        <w:r>
+          <w:rPr>
+            <w:noProof/>
+          </w:rPr>
+          <w:t>4</w:t>
+        </w:r>
+      </w:fldSimple>
       <w:r>
         <w:t>.</w:t>
       </w:r>
-      <w:r>
-        <w:fldChar w:fldCharType="begin"/>
-      </w:r>
-      <w:r>
-        <w:instrText xml:space="preserve"> SEQ Figure \* ARABIC \s 1 </w:instrText>
-      </w:r>
-      <w:r>
-        <w:fldChar w:fldCharType="separate"/>
-      </w:r>
-      <w:r>
-        <w:rPr>
-          <w:noProof/>
-        </w:rPr>
-        <w:t>14</w:t>
-      </w:r>
-      <w:r>
-        <w:rPr>
-          <w:noProof/>
-        </w:rPr>
-        <w:fldChar w:fldCharType="end"/>
-      </w:r>
+      <w:fldSimple w:instr=" SEQ Figure \* ARABIC \s 1 ">
+        <w:r>
+          <w:rPr>
+            <w:noProof/>
+          </w:rPr>
+          <w:t>14</w:t>
+        </w:r>
+      </w:fldSimple>
       <w:r>
         <w:rPr>
           <w:lang w:val="en-US"/>
@@ -19518,58 +18835,32 @@
       <w:r>
         <w:t xml:space="preserve">Figure </w:t>
       </w:r>
-      <w:r>
-        <w:fldChar w:fldCharType="begin"/>
-      </w:r>
-      <w:r>
-        <w:instrText xml:space="preserve"> STYLEREF 1 \s </w:instrText>
-      </w:r>
-      <w:r>
-        <w:fldChar w:fldCharType="separate"/>
-      </w:r>
-      <w:r>
-        <w:rPr>
-          <w:noProof/>
-          <w:cs/>
-        </w:rPr>
-        <w:t>‎</w:t>
-      </w:r>
-      <w:r>
-        <w:rPr>
-          <w:noProof/>
-        </w:rPr>
-        <w:t>4</w:t>
-      </w:r>
-      <w:r>
-        <w:rPr>
-          <w:noProof/>
-        </w:rPr>
-        <w:fldChar w:fldCharType="end"/>
-      </w:r>
+      <w:fldSimple w:instr=" STYLEREF 1 \s ">
+        <w:r>
+          <w:rPr>
+            <w:noProof/>
+            <w:cs/>
+          </w:rPr>
+          <w:t>‎</w:t>
+        </w:r>
+        <w:r>
+          <w:rPr>
+            <w:noProof/>
+          </w:rPr>
+          <w:t>4</w:t>
+        </w:r>
+      </w:fldSimple>
       <w:r>
         <w:t>.</w:t>
       </w:r>
-      <w:r>
-        <w:fldChar w:fldCharType="begin"/>
-      </w:r>
-      <w:r>
-        <w:instrText xml:space="preserve"> SEQ Figure \* ARABIC \s 1 </w:instrText>
-      </w:r>
-      <w:r>
-        <w:fldChar w:fldCharType="separate"/>
-      </w:r>
-      <w:r>
-        <w:rPr>
-          <w:noProof/>
-        </w:rPr>
-        <w:t>15</w:t>
-      </w:r>
-      <w:r>
-        <w:rPr>
-          <w:noProof/>
-        </w:rPr>
-        <w:fldChar w:fldCharType="end"/>
-      </w:r>
+      <w:fldSimple w:instr=" SEQ Figure \* ARABIC \s 1 ">
+        <w:r>
+          <w:rPr>
+            <w:noProof/>
+          </w:rPr>
+          <w:t>15</w:t>
+        </w:r>
+      </w:fldSimple>
       <w:r>
         <w:rPr>
           <w:lang w:val="en-US"/>
@@ -20062,19 +19353,7 @@
         <w:rPr>
           <w:rStyle w:val="Hyperlink"/>
         </w:rPr>
-        <w:t>https://www.jm</w:t>
-      </w:r>
-      <w:r>
-        <w:rPr>
-          <w:rStyle w:val="Hyperlink"/>
-        </w:rPr>
-        <w:t>l</w:t>
-      </w:r>
-      <w:r>
-        <w:rPr>
-          <w:rStyle w:val="Hyperlink"/>
-        </w:rPr>
-        <w:t>r.org/papers/v13/bergstra12a.html</w:t>
+        <w:t>https://www.jmlr.org/papers/v13/bergstra12a.html</w:t>
       </w:r>
       <w:r>
         <w:fldChar w:fldCharType="end"/>
@@ -20530,58 +19809,32 @@
       <w:r>
         <w:t xml:space="preserve">Table </w:t>
       </w:r>
-      <w:r>
-        <w:fldChar w:fldCharType="begin"/>
-      </w:r>
-      <w:r>
-        <w:instrText xml:space="preserve"> STYLEREF 2 \s </w:instrText>
-      </w:r>
-      <w:r>
-        <w:fldChar w:fldCharType="separate"/>
-      </w:r>
-      <w:r>
-        <w:rPr>
-          <w:noProof/>
-          <w:cs/>
-        </w:rPr>
-        <w:t>‎</w:t>
-      </w:r>
-      <w:r>
-        <w:rPr>
-          <w:noProof/>
-        </w:rPr>
-        <w:t>A</w:t>
-      </w:r>
-      <w:r>
-        <w:rPr>
-          <w:noProof/>
-        </w:rPr>
-        <w:fldChar w:fldCharType="end"/>
-      </w:r>
+      <w:fldSimple w:instr=" STYLEREF 2 \s ">
+        <w:r>
+          <w:rPr>
+            <w:noProof/>
+            <w:cs/>
+          </w:rPr>
+          <w:t>‎</w:t>
+        </w:r>
+        <w:r>
+          <w:rPr>
+            <w:noProof/>
+          </w:rPr>
+          <w:t>A</w:t>
+        </w:r>
+      </w:fldSimple>
       <w:r>
         <w:t>:</w:t>
       </w:r>
-      <w:r>
-        <w:fldChar w:fldCharType="begin"/>
-      </w:r>
-      <w:r>
-        <w:instrText xml:space="preserve"> SEQ Table \* ARABIC \s 2 </w:instrText>
-      </w:r>
-      <w:r>
-        <w:fldChar w:fldCharType="separate"/>
-      </w:r>
-      <w:r>
-        <w:rPr>
-          <w:noProof/>
-        </w:rPr>
-        <w:t>1</w:t>
-      </w:r>
-      <w:r>
-        <w:rPr>
-          <w:noProof/>
-        </w:rPr>
-        <w:fldChar w:fldCharType="end"/>
-      </w:r>
+      <w:fldSimple w:instr=" SEQ Table \* ARABIC \s 2 ">
+        <w:r>
+          <w:rPr>
+            <w:noProof/>
+          </w:rPr>
+          <w:t>1</w:t>
+        </w:r>
+      </w:fldSimple>
       <w:r>
         <w:t xml:space="preserve"> </w:t>
       </w:r>
@@ -21246,58 +20499,32 @@
       <w:r>
         <w:t xml:space="preserve">Table </w:t>
       </w:r>
-      <w:r>
-        <w:fldChar w:fldCharType="begin"/>
-      </w:r>
-      <w:r>
-        <w:instrText xml:space="preserve"> STYLEREF 2 \s </w:instrText>
-      </w:r>
-      <w:r>
-        <w:fldChar w:fldCharType="separate"/>
-      </w:r>
-      <w:r>
-        <w:rPr>
-          <w:noProof/>
-          <w:cs/>
-        </w:rPr>
-        <w:t>‎</w:t>
-      </w:r>
-      <w:r>
-        <w:rPr>
-          <w:noProof/>
-        </w:rPr>
-        <w:t>B</w:t>
-      </w:r>
-      <w:r>
-        <w:rPr>
-          <w:noProof/>
-        </w:rPr>
-        <w:fldChar w:fldCharType="end"/>
-      </w:r>
+      <w:fldSimple w:instr=" STYLEREF 2 \s ">
+        <w:r>
+          <w:rPr>
+            <w:noProof/>
+            <w:cs/>
+          </w:rPr>
+          <w:t>‎</w:t>
+        </w:r>
+        <w:r>
+          <w:rPr>
+            <w:noProof/>
+          </w:rPr>
+          <w:t>B</w:t>
+        </w:r>
+      </w:fldSimple>
       <w:r>
         <w:t>:</w:t>
       </w:r>
-      <w:r>
-        <w:fldChar w:fldCharType="begin"/>
-      </w:r>
-      <w:r>
-        <w:instrText xml:space="preserve"> SEQ Table \* ARABIC \s 2 </w:instrText>
-      </w:r>
-      <w:r>
-        <w:fldChar w:fldCharType="separate"/>
-      </w:r>
-      <w:r>
-        <w:rPr>
-          <w:noProof/>
-        </w:rPr>
-        <w:t>1</w:t>
-      </w:r>
-      <w:r>
-        <w:rPr>
-          <w:noProof/>
-        </w:rPr>
-        <w:fldChar w:fldCharType="end"/>
-      </w:r>
+      <w:fldSimple w:instr=" SEQ Table \* ARABIC \s 2 ">
+        <w:r>
+          <w:rPr>
+            <w:noProof/>
+          </w:rPr>
+          <w:t>1</w:t>
+        </w:r>
+      </w:fldSimple>
       <w:r>
         <w:rPr>
           <w:lang w:val="en-US"/>
@@ -21631,58 +20858,32 @@
       <w:r>
         <w:t xml:space="preserve">Table </w:t>
       </w:r>
-      <w:r>
-        <w:fldChar w:fldCharType="begin"/>
-      </w:r>
-      <w:r>
-        <w:instrText xml:space="preserve"> STYLEREF 2 \s </w:instrText>
-      </w:r>
-      <w:r>
-        <w:fldChar w:fldCharType="separate"/>
-      </w:r>
-      <w:r>
-        <w:rPr>
-          <w:noProof/>
-          <w:cs/>
-        </w:rPr>
-        <w:t>‎</w:t>
-      </w:r>
-      <w:r>
-        <w:rPr>
-          <w:noProof/>
-        </w:rPr>
-        <w:t>C</w:t>
-      </w:r>
-      <w:r>
-        <w:rPr>
-          <w:noProof/>
-        </w:rPr>
-        <w:fldChar w:fldCharType="end"/>
-      </w:r>
+      <w:fldSimple w:instr=" STYLEREF 2 \s ">
+        <w:r>
+          <w:rPr>
+            <w:noProof/>
+            <w:cs/>
+          </w:rPr>
+          <w:t>‎</w:t>
+        </w:r>
+        <w:r>
+          <w:rPr>
+            <w:noProof/>
+          </w:rPr>
+          <w:t>C</w:t>
+        </w:r>
+      </w:fldSimple>
       <w:r>
         <w:t>:</w:t>
       </w:r>
-      <w:r>
-        <w:fldChar w:fldCharType="begin"/>
-      </w:r>
-      <w:r>
-        <w:instrText xml:space="preserve"> SEQ Table \* ARABIC \s 2 </w:instrText>
-      </w:r>
-      <w:r>
-        <w:fldChar w:fldCharType="separate"/>
-      </w:r>
-      <w:r>
-        <w:rPr>
-          <w:noProof/>
-        </w:rPr>
-        <w:t>1</w:t>
-      </w:r>
-      <w:r>
-        <w:rPr>
-          <w:noProof/>
-        </w:rPr>
-        <w:fldChar w:fldCharType="end"/>
-      </w:r>
+      <w:fldSimple w:instr=" SEQ Table \* ARABIC \s 2 ">
+        <w:r>
+          <w:rPr>
+            <w:noProof/>
+          </w:rPr>
+          <w:t>1</w:t>
+        </w:r>
+      </w:fldSimple>
       <w:r>
         <w:rPr>
           <w:lang w:val="en-US"/>
@@ -22135,58 +21336,32 @@
       <w:r>
         <w:t xml:space="preserve">Table </w:t>
       </w:r>
-      <w:r>
-        <w:fldChar w:fldCharType="begin"/>
-      </w:r>
-      <w:r>
-        <w:instrText xml:space="preserve"> STYLEREF 2 \s </w:instrText>
-      </w:r>
-      <w:r>
-        <w:fldChar w:fldCharType="separate"/>
-      </w:r>
-      <w:r>
-        <w:rPr>
-          <w:noProof/>
-          <w:cs/>
-        </w:rPr>
-        <w:t>‎</w:t>
-      </w:r>
-      <w:r>
-        <w:rPr>
-          <w:noProof/>
-        </w:rPr>
-        <w:t>D</w:t>
-      </w:r>
-      <w:r>
-        <w:rPr>
-          <w:noProof/>
-        </w:rPr>
-        <w:fldChar w:fldCharType="end"/>
-      </w:r>
+      <w:fldSimple w:instr=" STYLEREF 2 \s ">
+        <w:r>
+          <w:rPr>
+            <w:noProof/>
+            <w:cs/>
+          </w:rPr>
+          <w:t>‎</w:t>
+        </w:r>
+        <w:r>
+          <w:rPr>
+            <w:noProof/>
+          </w:rPr>
+          <w:t>D</w:t>
+        </w:r>
+      </w:fldSimple>
       <w:r>
         <w:t>:</w:t>
       </w:r>
-      <w:r>
-        <w:fldChar w:fldCharType="begin"/>
-      </w:r>
-      <w:r>
-        <w:instrText xml:space="preserve"> SEQ Table \* ARABIC \s 2 </w:instrText>
-      </w:r>
-      <w:r>
-        <w:fldChar w:fldCharType="separate"/>
-      </w:r>
-      <w:r>
-        <w:rPr>
-          <w:noProof/>
-        </w:rPr>
-        <w:t>1</w:t>
-      </w:r>
-      <w:r>
-        <w:rPr>
-          <w:noProof/>
-        </w:rPr>
-        <w:fldChar w:fldCharType="end"/>
-      </w:r>
+      <w:fldSimple w:instr=" SEQ Table \* ARABIC \s 2 ">
+        <w:r>
+          <w:rPr>
+            <w:noProof/>
+          </w:rPr>
+          <w:t>1</w:t>
+        </w:r>
+      </w:fldSimple>
       <w:r>
         <w:rPr>
           <w:lang w:val="en-US"/>
@@ -22521,58 +21696,32 @@
       <w:r>
         <w:t xml:space="preserve">Table </w:t>
       </w:r>
-      <w:r>
-        <w:fldChar w:fldCharType="begin"/>
-      </w:r>
-      <w:r>
-        <w:instrText xml:space="preserve"> STYLEREF 2 \s </w:instrText>
-      </w:r>
-      <w:r>
-        <w:fldChar w:fldCharType="separate"/>
-      </w:r>
-      <w:r>
-        <w:rPr>
-          <w:noProof/>
-          <w:cs/>
-        </w:rPr>
-        <w:t>‎</w:t>
-      </w:r>
-      <w:r>
-        <w:rPr>
-          <w:noProof/>
-        </w:rPr>
-        <w:t>E</w:t>
-      </w:r>
-      <w:r>
-        <w:rPr>
-          <w:noProof/>
-        </w:rPr>
-        <w:fldChar w:fldCharType="end"/>
-      </w:r>
+      <w:fldSimple w:instr=" STYLEREF 2 \s ">
+        <w:r>
+          <w:rPr>
+            <w:noProof/>
+            <w:cs/>
+          </w:rPr>
+          <w:t>‎</w:t>
+        </w:r>
+        <w:r>
+          <w:rPr>
+            <w:noProof/>
+          </w:rPr>
+          <w:t>E</w:t>
+        </w:r>
+      </w:fldSimple>
       <w:r>
         <w:t>:</w:t>
       </w:r>
-      <w:r>
-        <w:fldChar w:fldCharType="begin"/>
-      </w:r>
-      <w:r>
-        <w:instrText xml:space="preserve"> SEQ Table \* ARABIC \s 2 </w:instrText>
-      </w:r>
-      <w:r>
-        <w:fldChar w:fldCharType="separate"/>
-      </w:r>
-      <w:r>
-        <w:rPr>
-          <w:noProof/>
-        </w:rPr>
-        <w:t>1</w:t>
-      </w:r>
-      <w:r>
-        <w:rPr>
-          <w:noProof/>
-        </w:rPr>
-        <w:fldChar w:fldCharType="end"/>
-      </w:r>
+      <w:fldSimple w:instr=" SEQ Table \* ARABIC \s 2 ">
+        <w:r>
+          <w:rPr>
+            <w:noProof/>
+          </w:rPr>
+          <w:t>1</w:t>
+        </w:r>
+      </w:fldSimple>
       <w:r>
         <w:rPr>
           <w:lang w:val="en-US"/>
@@ -22778,58 +21927,32 @@
       <w:r>
         <w:t xml:space="preserve">Table </w:t>
       </w:r>
-      <w:r>
-        <w:fldChar w:fldCharType="begin"/>
-      </w:r>
-      <w:r>
-        <w:instrText xml:space="preserve"> STYLEREF 2 \s </w:instrText>
-      </w:r>
-      <w:r>
-        <w:fldChar w:fldCharType="separate"/>
-      </w:r>
-      <w:r>
-        <w:rPr>
-          <w:noProof/>
-          <w:cs/>
-        </w:rPr>
-        <w:t>‎</w:t>
-      </w:r>
-      <w:r>
-        <w:rPr>
-          <w:noProof/>
-        </w:rPr>
-        <w:t>F</w:t>
-      </w:r>
-      <w:r>
-        <w:rPr>
-          <w:noProof/>
-        </w:rPr>
-        <w:fldChar w:fldCharType="end"/>
-      </w:r>
+      <w:fldSimple w:instr=" STYLEREF 2 \s ">
+        <w:r>
+          <w:rPr>
+            <w:noProof/>
+            <w:cs/>
+          </w:rPr>
+          <w:t>‎</w:t>
+        </w:r>
+        <w:r>
+          <w:rPr>
+            <w:noProof/>
+          </w:rPr>
+          <w:t>F</w:t>
+        </w:r>
+      </w:fldSimple>
       <w:r>
         <w:t>:</w:t>
       </w:r>
-      <w:r>
-        <w:fldChar w:fldCharType="begin"/>
-      </w:r>
-      <w:r>
-        <w:instrText xml:space="preserve"> SEQ Table \* ARABIC \s 2 </w:instrText>
-      </w:r>
-      <w:r>
-        <w:fldChar w:fldCharType="separate"/>
-      </w:r>
-      <w:r>
-        <w:rPr>
-          <w:noProof/>
-        </w:rPr>
-        <w:t>1</w:t>
-      </w:r>
-      <w:r>
-        <w:rPr>
-          <w:noProof/>
-        </w:rPr>
-        <w:fldChar w:fldCharType="end"/>
-      </w:r>
+      <w:fldSimple w:instr=" SEQ Table \* ARABIC \s 2 ">
+        <w:r>
+          <w:rPr>
+            <w:noProof/>
+          </w:rPr>
+          <w:t>1</w:t>
+        </w:r>
+      </w:fldSimple>
       <w:r>
         <w:rPr>
           <w:lang w:val="en-US"/>
@@ -23490,58 +22613,32 @@
       <w:r>
         <w:t xml:space="preserve">Figure </w:t>
       </w:r>
-      <w:r>
-        <w:fldChar w:fldCharType="begin"/>
-      </w:r>
-      <w:r>
-        <w:instrText xml:space="preserve"> STYLEREF 1 \s </w:instrText>
-      </w:r>
-      <w:r>
-        <w:fldChar w:fldCharType="separate"/>
-      </w:r>
-      <w:r>
-        <w:rPr>
-          <w:noProof/>
-          <w:cs/>
-        </w:rPr>
-        <w:t>‎</w:t>
-      </w:r>
-      <w:r>
-        <w:rPr>
-          <w:noProof/>
-        </w:rPr>
-        <w:t>0</w:t>
-      </w:r>
-      <w:r>
-        <w:rPr>
-          <w:noProof/>
-        </w:rPr>
-        <w:fldChar w:fldCharType="end"/>
-      </w:r>
+      <w:fldSimple w:instr=" STYLEREF 1 \s ">
+        <w:r>
+          <w:rPr>
+            <w:noProof/>
+            <w:cs/>
+          </w:rPr>
+          <w:t>‎</w:t>
+        </w:r>
+        <w:r>
+          <w:rPr>
+            <w:noProof/>
+          </w:rPr>
+          <w:t>0</w:t>
+        </w:r>
+      </w:fldSimple>
       <w:r>
         <w:t>.</w:t>
       </w:r>
-      <w:r>
-        <w:fldChar w:fldCharType="begin"/>
-      </w:r>
-      <w:r>
-        <w:instrText xml:space="preserve"> SEQ Figure \* ARABIC \s 1 </w:instrText>
-      </w:r>
-      <w:r>
-        <w:fldChar w:fldCharType="separate"/>
-      </w:r>
-      <w:r>
-        <w:rPr>
-          <w:noProof/>
-        </w:rPr>
-        <w:t>1</w:t>
-      </w:r>
-      <w:r>
-        <w:rPr>
-          <w:noProof/>
-        </w:rPr>
-        <w:fldChar w:fldCharType="end"/>
-      </w:r>
+      <w:fldSimple w:instr=" SEQ Figure \* ARABIC \s 1 ">
+        <w:r>
+          <w:rPr>
+            <w:noProof/>
+          </w:rPr>
+          <w:t>1</w:t>
+        </w:r>
+      </w:fldSimple>
       <w:r>
         <w:rPr>
           <w:lang w:val="en-US"/>
@@ -23665,58 +22762,32 @@
       <w:r>
         <w:t xml:space="preserve">Figure </w:t>
       </w:r>
-      <w:r>
-        <w:fldChar w:fldCharType="begin"/>
-      </w:r>
-      <w:r>
-        <w:instrText xml:space="preserve"> STYLEREF 1 \s </w:instrText>
-      </w:r>
-      <w:r>
-        <w:fldChar w:fldCharType="separate"/>
-      </w:r>
-      <w:r>
-        <w:rPr>
-          <w:noProof/>
-          <w:cs/>
-        </w:rPr>
-        <w:t>‎</w:t>
-      </w:r>
-      <w:r>
-        <w:rPr>
-          <w:noProof/>
-        </w:rPr>
-        <w:t>0</w:t>
-      </w:r>
-      <w:r>
-        <w:rPr>
-          <w:noProof/>
-        </w:rPr>
-        <w:fldChar w:fldCharType="end"/>
-      </w:r>
+      <w:fldSimple w:instr=" STYLEREF 1 \s ">
+        <w:r>
+          <w:rPr>
+            <w:noProof/>
+            <w:cs/>
+          </w:rPr>
+          <w:t>‎</w:t>
+        </w:r>
+        <w:r>
+          <w:rPr>
+            <w:noProof/>
+          </w:rPr>
+          <w:t>0</w:t>
+        </w:r>
+      </w:fldSimple>
       <w:r>
         <w:t>.</w:t>
       </w:r>
-      <w:r>
-        <w:fldChar w:fldCharType="begin"/>
-      </w:r>
-      <w:r>
-        <w:instrText xml:space="preserve"> SEQ Figure \* ARABIC \s 1 </w:instrText>
-      </w:r>
-      <w:r>
-        <w:fldChar w:fldCharType="separate"/>
-      </w:r>
-      <w:r>
-        <w:rPr>
-          <w:noProof/>
-        </w:rPr>
-        <w:t>2</w:t>
-      </w:r>
-      <w:r>
-        <w:rPr>
-          <w:noProof/>
-        </w:rPr>
-        <w:fldChar w:fldCharType="end"/>
-      </w:r>
+      <w:fldSimple w:instr=" SEQ Figure \* ARABIC \s 1 ">
+        <w:r>
+          <w:rPr>
+            <w:noProof/>
+          </w:rPr>
+          <w:t>2</w:t>
+        </w:r>
+      </w:fldSimple>
       <w:r>
         <w:rPr>
           <w:lang w:val="en-US"/>
@@ -23841,58 +22912,32 @@
       <w:r>
         <w:t xml:space="preserve">Figure </w:t>
       </w:r>
-      <w:r>
-        <w:fldChar w:fldCharType="begin"/>
-      </w:r>
-      <w:r>
-        <w:instrText xml:space="preserve"> STYLEREF 1 \s </w:instrText>
-      </w:r>
-      <w:r>
-        <w:fldChar w:fldCharType="separate"/>
-      </w:r>
-      <w:r>
-        <w:rPr>
-          <w:noProof/>
-          <w:cs/>
-        </w:rPr>
-        <w:t>‎</w:t>
-      </w:r>
-      <w:r>
-        <w:rPr>
-          <w:noProof/>
-        </w:rPr>
-        <w:t>0</w:t>
-      </w:r>
-      <w:r>
-        <w:rPr>
-          <w:noProof/>
-        </w:rPr>
-        <w:fldChar w:fldCharType="end"/>
-      </w:r>
+      <w:fldSimple w:instr=" STYLEREF 1 \s ">
+        <w:r>
+          <w:rPr>
+            <w:noProof/>
+            <w:cs/>
+          </w:rPr>
+          <w:t>‎</w:t>
+        </w:r>
+        <w:r>
+          <w:rPr>
+            <w:noProof/>
+          </w:rPr>
+          <w:t>0</w:t>
+        </w:r>
+      </w:fldSimple>
       <w:r>
         <w:t>.</w:t>
       </w:r>
-      <w:r>
-        <w:fldChar w:fldCharType="begin"/>
-      </w:r>
-      <w:r>
-        <w:instrText xml:space="preserve"> SEQ Figure \* ARABIC \s 1 </w:instrText>
-      </w:r>
-      <w:r>
-        <w:fldChar w:fldCharType="separate"/>
-      </w:r>
-      <w:r>
-        <w:rPr>
-          <w:noProof/>
-        </w:rPr>
-        <w:t>3</w:t>
-      </w:r>
-      <w:r>
-        <w:rPr>
-          <w:noProof/>
-        </w:rPr>
-        <w:fldChar w:fldCharType="end"/>
-      </w:r>
+      <w:fldSimple w:instr=" SEQ Figure \* ARABIC \s 1 ">
+        <w:r>
+          <w:rPr>
+            <w:noProof/>
+          </w:rPr>
+          <w:t>3</w:t>
+        </w:r>
+      </w:fldSimple>
       <w:r>
         <w:rPr>
           <w:lang w:val="en-US"/>
@@ -24615,58 +23660,32 @@
       <w:r>
         <w:t xml:space="preserve">Table </w:t>
       </w:r>
-      <w:r>
-        <w:fldChar w:fldCharType="begin"/>
-      </w:r>
-      <w:r>
-        <w:instrText xml:space="preserve"> STYLEREF 2 \s </w:instrText>
-      </w:r>
-      <w:r>
-        <w:fldChar w:fldCharType="separate"/>
-      </w:r>
-      <w:r>
-        <w:rPr>
-          <w:noProof/>
-          <w:cs/>
-        </w:rPr>
-        <w:t>‎</w:t>
-      </w:r>
-      <w:r>
-        <w:rPr>
-          <w:noProof/>
-        </w:rPr>
-        <w:t>H</w:t>
-      </w:r>
-      <w:r>
-        <w:rPr>
-          <w:noProof/>
-        </w:rPr>
-        <w:fldChar w:fldCharType="end"/>
-      </w:r>
+      <w:fldSimple w:instr=" STYLEREF 2 \s ">
+        <w:r>
+          <w:rPr>
+            <w:noProof/>
+            <w:cs/>
+          </w:rPr>
+          <w:t>‎</w:t>
+        </w:r>
+        <w:r>
+          <w:rPr>
+            <w:noProof/>
+          </w:rPr>
+          <w:t>H</w:t>
+        </w:r>
+      </w:fldSimple>
       <w:r>
         <w:t>:</w:t>
       </w:r>
-      <w:r>
-        <w:fldChar w:fldCharType="begin"/>
-      </w:r>
-      <w:r>
-        <w:instrText xml:space="preserve"> SEQ Table \* ARABIC \s 2 </w:instrText>
-      </w:r>
-      <w:r>
-        <w:fldChar w:fldCharType="separate"/>
-      </w:r>
-      <w:r>
-        <w:rPr>
-          <w:noProof/>
-        </w:rPr>
-        <w:t>1</w:t>
-      </w:r>
-      <w:r>
-        <w:rPr>
-          <w:noProof/>
-        </w:rPr>
-        <w:fldChar w:fldCharType="end"/>
-      </w:r>
+      <w:fldSimple w:instr=" SEQ Table \* ARABIC \s 2 ">
+        <w:r>
+          <w:rPr>
+            <w:noProof/>
+          </w:rPr>
+          <w:t>1</w:t>
+        </w:r>
+      </w:fldSimple>
       <w:r>
         <w:rPr>
           <w:lang w:val="en-US"/>
@@ -25012,58 +24031,32 @@
       <w:r>
         <w:t xml:space="preserve">Figure </w:t>
       </w:r>
-      <w:r>
-        <w:fldChar w:fldCharType="begin"/>
-      </w:r>
-      <w:r>
-        <w:instrText xml:space="preserve"> STYLEREF 1 \s </w:instrText>
-      </w:r>
-      <w:r>
-        <w:fldChar w:fldCharType="separate"/>
-      </w:r>
-      <w:r>
-        <w:rPr>
-          <w:noProof/>
-          <w:cs/>
-        </w:rPr>
-        <w:t>‎</w:t>
-      </w:r>
-      <w:r>
-        <w:rPr>
-          <w:noProof/>
-        </w:rPr>
-        <w:t>0</w:t>
-      </w:r>
-      <w:r>
-        <w:rPr>
-          <w:noProof/>
-        </w:rPr>
-        <w:fldChar w:fldCharType="end"/>
-      </w:r>
+      <w:fldSimple w:instr=" STYLEREF 1 \s ">
+        <w:r>
+          <w:rPr>
+            <w:noProof/>
+            <w:cs/>
+          </w:rPr>
+          <w:t>‎</w:t>
+        </w:r>
+        <w:r>
+          <w:rPr>
+            <w:noProof/>
+          </w:rPr>
+          <w:t>0</w:t>
+        </w:r>
+      </w:fldSimple>
       <w:r>
         <w:t>.</w:t>
       </w:r>
-      <w:r>
-        <w:fldChar w:fldCharType="begin"/>
-      </w:r>
-      <w:r>
-        <w:instrText xml:space="preserve"> SEQ Figure \* ARABIC \s 1 </w:instrText>
-      </w:r>
-      <w:r>
-        <w:fldChar w:fldCharType="separate"/>
-      </w:r>
-      <w:r>
-        <w:rPr>
-          <w:noProof/>
-        </w:rPr>
-        <w:t>4</w:t>
-      </w:r>
-      <w:r>
-        <w:rPr>
-          <w:noProof/>
-        </w:rPr>
-        <w:fldChar w:fldCharType="end"/>
-      </w:r>
+      <w:fldSimple w:instr=" SEQ Figure \* ARABIC \s 1 ">
+        <w:r>
+          <w:rPr>
+            <w:noProof/>
+          </w:rPr>
+          <w:t>4</w:t>
+        </w:r>
+      </w:fldSimple>
       <w:r>
         <w:rPr>
           <w:lang w:val="en-US"/>

</xml_diff>